<commit_message>
feat: update resume page with latest CV content and fix README name
- Reorder resume sections: Experience → Education → Projects → Skills
- Sync all content from updated resume PDF
- Fix deploy script (next build replaces removed next export)
- Fix README: Shoaib → Achyut

Co-Authored-By: Claude Sonnet 4.6 <noreply@anthropic.com>
</commit_message>
<xml_diff>
--- a/public/COSC4896_VideoUnderstanding_Niroula.docx
+++ b/public/COSC4896_VideoUnderstanding_Niroula.docx
@@ -2,79 +2,6 @@
 <file path=word/document.xml><?xml version="1.0" encoding="utf-8"?>
 <w:document xmlns:wpc="http://schemas.microsoft.com/office/word/2010/wordprocessingCanvas" xmlns:cx="http://schemas.microsoft.com/office/drawing/2014/chartex" xmlns:cx1="http://schemas.microsoft.com/office/drawing/2015/9/8/chartex" xmlns:cx2="http://schemas.microsoft.com/office/drawing/2015/10/21/chartex" xmlns:cx3="http://schemas.microsoft.com/office/drawing/2016/5/9/chartex" xmlns:cx4="http://schemas.microsoft.com/office/drawing/2016/5/10/chartex" xmlns:cx5="http://schemas.microsoft.com/office/drawing/2016/5/11/chartex" xmlns:cx6="http://schemas.microsoft.com/office/drawing/2016/5/12/chartex" xmlns:cx7="http://schemas.microsoft.com/office/drawing/2016/5/13/chartex" xmlns:cx8="http://schemas.microsoft.com/office/drawing/2016/5/14/chartex" xmlns:mc="http://schemas.openxmlformats.org/markup-compatibility/2006" xmlns:aink="http://schemas.microsoft.com/office/drawing/2016/ink" xmlns:am3d="http://schemas.microsoft.com/office/drawing/2017/model3d" xmlns:o="urn:schemas-microsoft-com:office:office" xmlns:oel="http://schemas.microsoft.com/office/2019/extlst" xmlns:r="http://schemas.openxmlformats.org/officeDocument/2006/relationships" xmlns:m="http://schemas.openxmlformats.org/officeDocument/2006/math" xmlns:v="urn:schemas-microsoft-com:vml" xmlns:wp14="http://schemas.microsoft.com/office/word/2010/wordprocessingDrawing" xmlns:wp="http://schemas.openxmlformats.org/drawingml/2006/wordprocessingDrawing" xmlns:w10="urn:schemas-microsoft-com:office:word" xmlns:w="http://schemas.openxmlformats.org/wordprocessingml/2006/main" xmlns:w14="http://schemas.microsoft.com/office/word/2010/wordml" xmlns:w15="http://schemas.microsoft.com/office/word/2012/wordml" xmlns:w16cex="http://schemas.microsoft.com/office/word/2018/wordml/cex" xmlns:w16cid="http://schemas.microsoft.com/office/word/2016/wordml/cid" xmlns:w16="http://schemas.microsoft.com/office/word/2018/wordml" xmlns:w16du="http://schemas.microsoft.com/office/word/2023/wordml/word16du" xmlns:w16sdtdh="http://schemas.microsoft.com/office/word/2020/wordml/sdtdatahash" xmlns:w16sdtfl="http://schemas.microsoft.com/office/word/2024/wordml/sdtformatlock" xmlns:w16se="http://schemas.microsoft.com/office/word/2015/wordml/symex" xmlns:wpg="http://schemas.microsoft.com/office/word/2010/wordprocessingGroup" xmlns:wpi="http://schemas.microsoft.com/office/word/2010/wordprocessingInk" xmlns:wne="http://schemas.microsoft.com/office/word/2006/wordml" xmlns:wps="http://schemas.microsoft.com/office/word/2010/wordprocessingShape" mc:Ignorable="w14 w15 w16se w16cid w16 w16cex w16sdtdh w16sdtfl w16du wp14">
   <w:body>
-    <w:p>
-      <w:pPr>
-        <w:spacing w:after="80"/>
-        <w:jc w:val="center"/>
-      </w:pPr>
-      <w:r>
-        <w:rPr>
-          <w:b/>
-          <w:bCs/>
-          <w:color w:val="1F3864"/>
-          <w:sz w:val="32"/>
-          <w:szCs w:val="32"/>
-        </w:rPr>
-        <w:t>A Cloud-Native Multimodal Video Understanding Platform</w:t>
-      </w:r>
-    </w:p>
-    <w:p>
-      <w:pPr>
-        <w:spacing w:after="160"/>
-        <w:jc w:val="center"/>
-      </w:pPr>
-      <w:r>
-        <w:rPr>
-          <w:i/>
-          <w:iCs/>
-          <w:color w:val="444444"/>
-          <w:sz w:val="24"/>
-          <w:szCs w:val="24"/>
-        </w:rPr>
-        <w:t>Using Deep Learning, Multimodal Fusion, and Large Vision-Language Models</w:t>
-      </w:r>
-    </w:p>
-    <w:p>
-      <w:pPr>
-        <w:spacing w:after="60"/>
-        <w:jc w:val="center"/>
-      </w:pPr>
-      <w:r>
-        <w:rPr>
-          <w:b/>
-          <w:bCs/>
-          <w:sz w:val="22"/>
-          <w:szCs w:val="22"/>
-        </w:rPr>
-        <w:t>Achyut Niroula</w:t>
-      </w:r>
-    </w:p>
-    <w:p>
-      <w:pPr>
-        <w:spacing w:after="60"/>
-        <w:jc w:val="center"/>
-      </w:pPr>
-      <w:r>
-        <w:rPr>
-          <w:color w:val="555555"/>
-        </w:rPr>
-        <w:t>Department of Computer Science, Nipissing University, North Bay, Ontario, Canada</w:t>
-      </w:r>
-    </w:p>
-    <w:p>
-      <w:pPr>
-        <w:spacing w:after="200"/>
-        <w:jc w:val="center"/>
-      </w:pPr>
-      <w:r>
-        <w:rPr>
-          <w:color w:val="777777"/>
-          <w:sz w:val="18"/>
-          <w:szCs w:val="18"/>
-        </w:rPr>
-        <w:t>COSC 4896 – Honours Research I  ·  Winter 2026</w:t>
-      </w:r>
-    </w:p>
     <w:p>
       <w:pPr>
         <w:pBdr>
@@ -141,21 +68,7 @@
           <w:sz w:val="19"/>
           <w:szCs w:val="19"/>
         </w:rPr>
-        <w:t>analytically demanding problem: a short clip simultaneously encodes spatial structure, object identities, depth relationships, temporal dynamics, spoken language, and environmental audio. Most existing systems address only a subset of these modalities, producing analyses that are either too shallow for practical use or too narrowly scoped for general application. This paper presents a Cloud-Native Multimodal Video Understanding Platform, a system with fully deployed worker, that fuses nine specialized AI p</w:t>
-      </w:r>
-      <w:r>
-        <w:rPr>
-          <w:sz w:val="19"/>
-          <w:szCs w:val="19"/>
-        </w:rPr>
-        <w:t>erception models into a structured Unified Scene Representation (USR), which drives Qwen2-VL dense captioning and Claude-powered narrative synthesis. Development proceeded through three iterative phases, each motivated by concrete technical challenges: a CPU-only cloud architecture proof-of-concept (Phase 1), a GPU-accelerated three-model YOLO ensemble with Weighted Boxes Fusion (Phase 2), and a full nine-model multimodal perception pipeline with a MultiModal Fusion Engine (Phase 3). The completed system pr</w:t>
-      </w:r>
-      <w:r>
-        <w:rPr>
-          <w:sz w:val="19"/>
-          <w:szCs w:val="19"/>
-        </w:rPr>
-        <w:t>ocesses a 33-second video in approximately 25 minutes on an NVIDIA T4 GPU (EC2 g4dn.xlarge), constrained by the 16 GB VRAM budget of the T4 and an AWS quota ceiling that prevented access to higher-throughput GPU instances. Evaluation across a diverse set of test videos demonstrates that the multimodal fusion approach produces qualitatively richer and more accurate narratives than direct VLM inference alone. Results, limitations, and future directions are discussed.</w:t>
+        <w:t>analytically demanding problem: a short clip simultaneously encodes spatial structure, object identities, depth relationships, temporal dynamics, spoken language, and environmental audio. Most existing systems address only a subset of these modalities, producing analyses that are either too shallow for practical use or too narrowly scoped for general application. This paper presents a Cloud-Native Multimodal Video Understanding Platform, a system with fully deployed worker, that fuses nine specialized AI perception models into a structured Unified Scene Representation (USR), which drives Qwen2-VL dense captioning and Claude-powered narrative synthesis. Development proceeded through three iterative phases, each motivated by concrete technical challenges: a CPU-only cloud architecture proof-of-concept (Phase 1), a GPU-accelerated three-model YOLO ensemble with Weighted Boxes Fusion (Phase 2), and a full nine-model multimodal perception pipeline with a MultiModal Fusion Engine (Phase 3). The completed system processes a 33-second video in approximately 25 minutes on an NVIDIA T4 GPU (EC2 g4dn.xlarge), constrained by the 16 GB VRAM budget of the T4 and an AWS quota ceiling that prevented access to higher-throughput GPU instances. Evaluation across a diverse set of test videos demonstrates that the multimodal fusion approach produces qualitatively richer and more accurate narratives than direct VLM inference alone. Results, limitations, and future directions are discussed.</w:t>
       </w:r>
     </w:p>
     <w:p>
@@ -183,10 +96,7 @@
         <w:jc w:val="both"/>
       </w:pPr>
       <w:r>
-        <w:t xml:space="preserve">Video is simultaneously the most information-dense and most analytically challenging sensor modality available to automated systems. A single 30-second clip at standard resolution encodes thousands of individual frames, a complete audio track with speech and environmental events, temporal dynamics that describe how scenes </w:t>
-      </w:r>
-      <w:r>
-        <w:t>evolve, and high-level semantic context that integrates all of the above. Despite decades of progress in computer vision and speech processing, most production-grade video analysis systems remain siloed: object detectors process individual frames without temporal awareness, transcription engines ignore visual context, and scene classifiers provide coarse labels that discard the precise spatial and temporal structure of what actually occurs.</w:t>
+        <w:t>Video is simultaneously the most information-dense and most analytically challenging sensor modality available to automated systems. A single 30-second clip at standard resolution encodes thousands of individual frames, a complete audio track with speech and environmental events, temporal dynamics that describe how scenes evolve, and high-level semantic context that integrates all of the above. Despite decades of progress in computer vision and speech processing, most production-grade video analysis systems remain siloed: object detectors process individual frames without temporal awareness, transcription engines ignore visual context, and scene classifiers provide coarse labels that discard the precise spatial and temporal structure of what actually occurs.</w:t>
       </w:r>
     </w:p>
     <w:p>
@@ -196,10 +106,7 @@
         <w:jc w:val="both"/>
       </w:pPr>
       <w:r>
-        <w:t>The central thesis of this project is that genuine video understanding requires fusing every available modality into a structured intermediate representation, and then reasoning over that representation using a vision-language model capable of generating coherent natural language. No single model, however powerful, can replicate this integration alone: a large language model without visual grounding hallucinates visual details; an object detector without language cannot express relationships between objects</w:t>
-      </w:r>
-      <w:r>
-        <w:t>; a transcription system without visual context cannot annotate what is happening during silences.</w:t>
+        <w:t>The central thesis of this project is that genuine video understanding requires fusing every available modality into a structured intermediate representation, and then reasoning over that representation using a vision-language model capable of generating coherent natural language. No single model, however powerful, can replicate this integration alone: a large language model without visual grounding hallucinates visual details; an object detector without language cannot express relationships between objects; a transcription system without visual context cannot annotate what is happening during silences.</w:t>
       </w:r>
     </w:p>
     <w:p>
@@ -309,7 +216,6 @@
           <w:b/>
           <w:bCs/>
         </w:rPr>
-        <w:lastRenderedPageBreak/>
         <w:t xml:space="preserve">5) </w:t>
       </w:r>
       <w:r>
@@ -384,6 +290,7 @@
           <w:b/>
           <w:bCs/>
         </w:rPr>
+        <w:lastRenderedPageBreak/>
         <w:t xml:space="preserve">3) </w:t>
       </w:r>
       <w:r>
@@ -710,10 +617,7 @@
         <w:jc w:val="both"/>
       </w:pPr>
       <w:r>
-        <w:t xml:space="preserve">Recent large vision-language models (VLMs) such as Video-LLaMA and Gemini 1.5 Pro accept raw video frames directly and produce free-form descriptions without a separate perception pipeline [Zhang et al., 2023]. While these models benefit from unified end-to-end training, they require substantially more VRAM than is available on cost-effective cloud hardware, and they do not expose structured intermediate representations (bounding boxes, depth maps, track IDs) useful for downstream applications. Dense video </w:t>
-      </w:r>
-      <w:r>
-        <w:t>captioning systems such as Vid2Seq [Yang et al., 2023] generate timestamped captions but focus on single-modality visual input without audio integration. VALOR [Chen et al., 2023] addresses audio-visual-language alignment but is not deployed as an accessible cloud pipeline.</w:t>
+        <w:t>Recent large vision-language models (VLMs) such as Video-LLaMA and Gemini 1.5 Pro accept raw video frames directly and produce free-form descriptions without a separate perception pipeline [Zhang et al., 2023]. While these models benefit from unified end-to-end training, they require substantially more VRAM than is available on cost-effective cloud hardware, and they do not expose structured intermediate representations (bounding boxes, depth maps, track IDs) useful for downstream applications. Dense video captioning systems such as Vid2Seq [Yang et al., 2023] generate timestamped captions but focus on single-modality visual input without audio integration. VALOR [Chen et al., 2023] addresses audio-visual-language alignment but is not deployed as an accessible cloud pipeline.</w:t>
       </w:r>
     </w:p>
     <w:p>
@@ -723,10 +627,7 @@
         <w:jc w:val="both"/>
       </w:pPr>
       <w:r>
-        <w:t xml:space="preserve">Multimodal ensemble approaches that combine specialized models have been explored in the document understanding and image captioning domains. In video, prior work combining object detection with speech transcription has typically been application-specific (e.g., </w:t>
-      </w:r>
-      <w:r>
-        <w:t>sports commentary, surveillance). The present work proposes a domain-agnostic, cloud-native architecture that fuses nine modalities through a structured representation, specifically targeting the production of human-readable narrative summaries. To the authors' knowledge, no prior system combines this breadth of modalities with a structured fusion engine and LLM-based narrative synthesis in a deployed cloud application.</w:t>
+        <w:t>Multimodal ensemble approaches that combine specialized models have been explored in the document understanding and image captioning domains. In video, prior work combining object detection with speech transcription has typically been application-specific (e.g., sports commentary, surveillance). The present work proposes a domain-agnostic, cloud-native architecture that fuses nine modalities through a structured representation, specifically targeting the production of human-readable narrative summaries. To the authors' knowledge, no prior system combines this breadth of modalities with a structured fusion engine and LLM-based narrative synthesis in a deployed cloud application.</w:t>
       </w:r>
     </w:p>
     <w:p>
@@ -746,10 +647,10 @@
         <w:jc w:val="both"/>
       </w:pPr>
       <w:r>
-        <w:t>The platform is architected across three tiers. The presentation tier is a Next.js web dashboard that handles user authentication via AWS Cognito and direct-to-S3 video uploads using presigned URLs. The application tier is a FastAPI REST backend managing workflow orchestration, presigned URL generation, DynamoDB state management, and SQS message dispatch. The compute tier is a containerized GPU worker deployed on an AWS EC2 g4dn.xlarge instance (NVIDIA T4 GPU, 16 GB VRAM, 4 vCPU), which executes the full pe</w:t>
-      </w:r>
-      <w:r>
-        <w:t>rception and fusion pipeline.</w:t>
+        <w:t xml:space="preserve">The platform is architected across three tiers. The presentation tier is a Next.js web dashboard that handles user authentication via AWS Cognito and direct-to-S3 video uploads using presigned URLs. The application tier is a FastAPI REST backend managing workflow orchestration, presigned URL generation, DynamoDB state management, and SQS message dispatch. The </w:t>
+      </w:r>
+      <w:r>
+        <w:t>compute tier is a containerized GPU worker deployed on an AWS EC2 g4dn.xlarge instance (NVIDIA T4 GPU, 16 GB VRAM, 4 vCPU), which executes the full perception and fusion pipeline.</w:t>
       </w:r>
     </w:p>
     <w:p>
@@ -759,10 +660,7 @@
         <w:jc w:val="both"/>
       </w:pPr>
       <w:r>
-        <w:t>The end-to-end data flow proceeds as follows: (1) a user uploads an MP4 through the frontend; (2) the backend generates a presigned S3 PUT URL and the video is uploaded directly to S3; (3) the backend enqueues a job message on SQS and sets video status to 'queued' in DynamoDB; (4) the GPU worker polls SQS, downloads the video from S3, and executes the full pipeline; (5) results (JSON analysis, narrative text, thumbnail) are written back to S3 and DynamoDB; (6) the frontend polls the backend for status updat</w:t>
-      </w:r>
-      <w:r>
-        <w:t>es and renders the completed analysis.</w:t>
+        <w:t>The end-to-end data flow proceeds as follows: (1) a user uploads an MP4 through the frontend; (2) the backend generates a presigned S3 PUT URL and the video is uploaded directly to S3; (3) the backend enqueues a job message on SQS and sets video status to 'queued' in DynamoDB; (4) the GPU worker polls SQS, downloads the video from S3, and executes the full pipeline; (5) results (JSON analysis, narrative text, thumbnail) are written back to S3 and DynamoDB; (6) the frontend polls the backend for status updates and renders the completed analysis.</w:t>
       </w:r>
     </w:p>
     <w:p>
@@ -802,7 +700,6 @@
         </w:pBdr>
       </w:pPr>
       <w:r>
-        <w:lastRenderedPageBreak/>
         <w:t>IV.  ITERATIVE DEVELOPMENT: PHASES, CHALLENGES, AND SOLUTIONS</w:t>
       </w:r>
     </w:p>
@@ -847,7 +744,11 @@
         <w:jc w:val="both"/>
       </w:pPr>
       <w:r>
-        <w:t>Phase 1 established the AWS infrastructure and deployed a CPU-only worker running YOLOv8n for object detection. The worker sampled frames at 1 FPS, ran detection on each frame, and assembled a simple template-based narrative from detection labels. AWS Cognito was integrated for user authentication, and SQS was used for asynchronous job dispatch.</w:t>
+        <w:t>Phase 1 established the AWS infrastructure and deployed a CPU-only worker running YOLOv8n for object detection. The worker sampled frames at 1 FPS, ran detection on each frame, and assembled a simple template-</w:t>
+      </w:r>
+      <w:r>
+        <w:lastRenderedPageBreak/>
+        <w:t>based narrative from detection labels. AWS Cognito was integrated for user authentication, and SQS was used for asynchronous job dispatch.</w:t>
       </w:r>
     </w:p>
     <w:p>
@@ -954,10 +855,7 @@
         <w:jc w:val="both"/>
       </w:pPr>
       <w:r>
-        <w:t xml:space="preserve">Phase 2 upgraded the worker to an EC2 g4dn.xlarge instance and introduced a three-model YOLO ensemble (YOLOv8s, YOLOv8m, and YOLO-World), whose outputs were merged using Weighted Boxes Fusion (WBF) [Sobol et al., 2022]. ByteTrack multi-object tracking and Mask2Former panoptic segmentation were also </w:t>
-      </w:r>
-      <w:r>
-        <w:t>introduced, enabling temporal continuity in object identity and richer scene decomposition.</w:t>
+        <w:t>Phase 2 upgraded the worker to an EC2 g4dn.xlarge instance and introduced a three-model YOLO ensemble (YOLOv8s, YOLOv8m, and YOLO-World), whose outputs were merged using Weighted Boxes Fusion (WBF) [Sobol et al., 2022]. ByteTrack multi-object tracking and Mask2Former panoptic segmentation were also introduced, enabling temporal continuity in object identity and richer scene decomposition.</w:t>
       </w:r>
     </w:p>
     <w:p>
@@ -993,7 +891,10 @@
         <w:t xml:space="preserve">Solution: </w:t>
       </w:r>
       <w:r>
-        <w:t>A sequential load-infer-unload strategy was implemented: each model is loaded onto the GPU, inference is run for all frames requiring that model, and the model is explicitly deleted and torch.cuda.empty_cache() called before the next model is loaded. This approach trades per-frame latency for memory safety, reducing peak VRAM from 14+ GB to the maximum footprint of any single model at a given time.</w:t>
+        <w:t xml:space="preserve">A sequential load-infer-unload strategy was implemented: each model is loaded onto the GPU, inference is run for all frames requiring that model, and the model is explicitly deleted and torch.cuda.empty_cache() called before the next model is loaded. This approach trades per-frame latency for memory safety, reducing peak </w:t>
+      </w:r>
+      <w:r>
+        <w:t>VRAM from 14+ GB to the maximum footprint of any single model at a given time.</w:t>
       </w:r>
     </w:p>
     <w:p>
@@ -1100,14 +1001,7 @@
         <w:t xml:space="preserve">Key Challenge — VRAM Budget with Nine Models: </w:t>
       </w:r>
       <w:r>
-        <w:t xml:space="preserve">The theoretical VRAM requirement of simultaneously loading all nine GPU models was approximately 26 GB — substantially exceeding the T4's 16 GB budget. Qwen2-VL alone in full FP16 precision requires 14 GB, already consuming 87.5% of the T4's capacity. Furthermore, an </w:t>
-      </w:r>
-      <w:r>
-        <w:lastRenderedPageBreak/>
-        <w:t>attempt to upgrade to an EC2 g5.2xlarge instance (NVIDIA A10, 24 GB VRAM) was blocked by an AWS quota restriction: the account's Running On-Demand G and VT instances vCPU limit was capped at 4, and a quota increase request to 8 vCPUs (case 1774</w:t>
-      </w:r>
-      <w:r>
-        <w:t>64638200784, submitted March 27, 2026) was rejected on April 6, 2026, citing insufficient usage history. This forced the project to remain on the g4dn.xlarge (T4, 16 GB) for all Phase 3 work.</w:t>
+        <w:t>The theoretical VRAM requirement of simultaneously loading all nine GPU models was approximately 26 GB — substantially exceeding the T4's 16 GB budget. Qwen2-VL alone in full FP16 precision requires 14 GB, already consuming 87.5% of the T4's capacity. Furthermore, an attempt to upgrade to an EC2 g5.2xlarge instance (NVIDIA A10, 24 GB VRAM) was blocked by an AWS quota restriction: the account's Running On-Demand G and VT instances vCPU limit was capped at 4, and a quota increase request to 8 vCPUs (case 177464638200784, submitted March 27, 2026) was rejected on April 6, 2026, citing insufficient usage history. This forced the project to remain on the g4dn.xlarge (T4, 16 GB) for all Phase 3 work.</w:t>
       </w:r>
     </w:p>
     <w:p>
@@ -1140,6 +1034,7 @@
           <w:i/>
           <w:iCs/>
         </w:rPr>
+        <w:lastRenderedPageBreak/>
         <w:t xml:space="preserve">Key Challenge — Fusion Engine Data Alignment: </w:t>
       </w:r>
       <w:r>
@@ -1213,10 +1108,7 @@
         <w:t xml:space="preserve">Outcome: </w:t>
       </w:r>
       <w:r>
-        <w:t>Phase 3 produced a fully functional nine-model multimodal pipeline. End-to-end processing time for a 33-second video was approximately 25 minutes on the T4 GPU (g4dn.xlarge). This latency is substantially higher than originally targeted and is a direct consequence of the T4's lower throughput relative to the A10 originally planned, compounded by the sequential load-infer-unload overhead required to fit within 16 GB of VRAM. Generated narratives were grounded, temporally coherent, and qualitatively richer th</w:t>
-      </w:r>
-      <w:r>
-        <w:t>an Phase 1/2 outputs.</w:t>
+        <w:t>Phase 3 produced a fully functional nine-model multimodal pipeline. End-to-end processing time for a 33-second video was approximately 25 minutes on the T4 GPU (g4dn.xlarge). This latency is substantially higher than originally targeted and is a direct consequence of the T4's lower throughput relative to the A10 originally planned, compounded by the sequential load-infer-unload overhead required to fit within 16 GB of VRAM. Generated narratives were grounded, temporally coherent, and qualitatively richer than Phase 1/2 outputs.</w:t>
       </w:r>
     </w:p>
     <w:p>
@@ -1463,14 +1355,7 @@
                 <w:sz w:val="18"/>
                 <w:szCs w:val="18"/>
               </w:rPr>
-              <w:t xml:space="preserve">SigLIP </w:t>
-            </w:r>
-            <w:r>
-              <w:rPr>
-                <w:sz w:val="18"/>
-                <w:szCs w:val="18"/>
-              </w:rPr>
-              <w:t>ViT-B/16</w:t>
+              <w:t>SigLIP ViT-B/16</w:t>
             </w:r>
           </w:p>
         </w:tc>
@@ -2694,11 +2579,7 @@
         <w:jc w:val="both"/>
       </w:pPr>
       <w:r>
-        <w:lastRenderedPageBreak/>
-        <w:t>The MultiModal Fusion Engine (MMFE) is the novel architectural contribution of this work. It receives the output of all nine models for a given frame and assembles a UnifiedSceneRepresentation (USR) — a typed Python dataclass containing the following fields: (i) a list of tracked object instances with class label, bounding box, ByteTrack ID, Mask2Former coverage, and DepthAnything depth zone; (ii) a list of background stuff regions with semantic label and coverage percentage; (iii) the SigLIP 768-dimensiona</w:t>
-      </w:r>
-      <w:r>
-        <w:t>l semantic embedding; (iv) spatial relationship triples from the scene graph generator; (v) top-5 SlowFast action predictions with confidence scores; (vi) Whisper transcript and speech confidence; (vii) CLAP audio event scores; (viii) Chromaprint music identification result; and (ix) a scene type label derived from a rule-based lookup on stuff regions.</w:t>
+        <w:t>The MultiModal Fusion Engine (MMFE) is the novel architectural contribution of this work. It receives the output of all nine models for a given frame and assembles a UnifiedSceneRepresentation (USR) — a typed Python dataclass containing the following fields: (i) a list of tracked object instances with class label, bounding box, ByteTrack ID, Mask2Former coverage, and DepthAnything depth zone; (ii) a list of background stuff regions with semantic label and coverage percentage; (iii) the SigLIP 768-dimensional semantic embedding; (iv) spatial relationship triples from the scene graph generator; (v) top-5 SlowFast action predictions with confidence scores; (vi) Whisper transcript and speech confidence; (vii) CLAP audio event scores; (viii) Chromaprint music identification result; and (ix) a scene type label derived from a rule-based lookup on stuff regions.</w:t>
       </w:r>
     </w:p>
     <w:p>
@@ -2708,6 +2589,7 @@
         <w:jc w:val="both"/>
       </w:pPr>
       <w:r>
+        <w:lastRenderedPageBreak/>
         <w:t>The MMFE applies temporal alignment to reconcile per-segment audio outputs with per-frame video timestamps, matches ByteTrack identities across frames, and normalises all numeric values to a [0, 1] range for consistent downstream consumption. The USR is serialised to JSON for logging and diagnosis, and a natural-language projection is constructed to serve as the structured prefix of the Qwen2-VL prompt.</w:t>
       </w:r>
     </w:p>
@@ -2753,10 +2635,7 @@
         <w:t>25</w:t>
       </w:r>
       <w:r>
-        <w:t xml:space="preserve"> short MP4 videos sourced from royalty-free repositories (Pixabay, Pexels, Wikimedia Commons) to avoid copyright restrictions. Videos were selected to cover six scene categories: outdoor/nature, indoor/domestic, sports/action, speech-heavy, music performance, and urban/street. Each video was 15–60 seconds in duration, encoded at 640×360 or 1280×720 resolution. For each video, a 2–4 sentence ground-truth description was written by the authors prior to running the system, describing the scene content, actor</w:t>
-      </w:r>
-      <w:r>
-        <w:t>s, setting, and notable audio. This ground-truth corpus serves as the reference for automated evaluation metrics.</w:t>
+        <w:t xml:space="preserve"> short MP4 videos sourced from royalty-free repositories (Pixabay, Pexels, Wikimedia Commons) to avoid copyright restrictions. Videos were selected to cover six scene categories: outdoor/nature, indoor/domestic, sports/action, speech-heavy, music performance, and urban/street. Each video was 15–60 seconds in duration, encoded at 640×360 or 1280×720 resolution. For each video, a 2–4 sentence ground-truth description was written by the authors prior to running the system, describing the scene content, actors, setting, and notable audio. This ground-truth corpus serves as the reference for automated evaluation metrics.</w:t>
       </w:r>
     </w:p>
     <w:p>
@@ -3260,14 +3139,7 @@
                 <w:sz w:val="18"/>
                 <w:szCs w:val="18"/>
               </w:rPr>
-              <w:t xml:space="preserve">Object tracking, </w:t>
-            </w:r>
-            <w:r>
-              <w:rPr>
-                <w:sz w:val="18"/>
-                <w:szCs w:val="18"/>
-              </w:rPr>
-              <w:t>action recognition</w:t>
+              <w:t>Object tracking, action recognition</w:t>
             </w:r>
           </w:p>
         </w:tc>
@@ -4642,6 +4514,7 @@
                 <w:sz w:val="18"/>
                 <w:szCs w:val="18"/>
               </w:rPr>
+              <w:lastRenderedPageBreak/>
               <w:t>VLM-only (Qwen2-VL zero-shot)</w:t>
             </w:r>
           </w:p>
@@ -6893,10 +6766,7 @@
         <w:jc w:val="both"/>
       </w:pPr>
       <w:r>
-        <w:t xml:space="preserve">Beyond quantitative metrics, qualitative differences between system variants were observed. The most significant quality gap was between the VLM-only baseline and the Full System: the zero-shot VLM frequently produced generic descriptions ('a person is standing near some trees') that lacked spatial grounding ('a person stands in the foreground, approximately two metres from the camera based on depth estimation, surrounded by trees covering 97% of the frame'). The VLM-only variant also failed to incorporate </w:t>
-      </w:r>
-      <w:r>
-        <w:t>audio context in scenes where music or speech was present, whereas the Full System integrated Chromaprint-identified piano music into narrative tone descriptions.</w:t>
+        <w:t>Beyond quantitative metrics, qualitative differences between system variants were observed. The most significant quality gap was between the VLM-only baseline and the Full System: the zero-shot VLM frequently produced generic descriptions ('a person is standing near some trees') that lacked spatial grounding ('a person stands in the foreground, approximately two metres from the camera based on depth estimation, surrounded by trees covering 97% of the frame'). The VLM-only variant also failed to incorporate audio context in scenes where music or speech was present, whereas the Full System integrated Chromaprint-identified piano music into narrative tone descriptions.</w:t>
       </w:r>
     </w:p>
     <w:p>
@@ -6935,20 +6805,13 @@
         <w:jc w:val="both"/>
       </w:pPr>
       <w:r>
-        <w:t xml:space="preserve">The multimodal pipeline approach described in this paper represents one of several viable strategies for video understanding. The primary alternative is a large end-to-end video-language model such as Video-LLaMA or Gemini 1.5 Pro, which accepts raw video frames directly </w:t>
-      </w:r>
-      <w:r>
-        <w:lastRenderedPageBreak/>
-        <w:t>and produces descriptions without a separate perception pipeline. These models benefit from unified training across modalities. However, they have significant disadvantages for our deployment context: (i) they require substantially more VRAM than cost-effective cloud instances provide; (ii) they do not expose structured intermediate representations useful for downstream applications such as indexing or anomaly detection; and (iii) they are less interpretable</w:t>
+        <w:t>The multimodal pipeline approach described in this paper represents one of several viable strategies for video understanding. The primary alternative is a large end-to-end video-language model such as Video-LLaMA or Gemini 1.5 Pro, which accepts raw video frames directly and produces descriptions without a separate perception pipeline. These models benefit from unified training across modalities. However, they have significant disadvantages for our deployment context: (i) they require substantially more VRAM than cost-effective cloud instances provide; (ii) they do not expose structured intermediate representations useful for downstream applications such as indexing or anomaly detection; and (iii) they are less interpretable</w:t>
       </w:r>
       <w:r>
         <w:t>,</w:t>
       </w:r>
       <w:r>
-        <w:t xml:space="preserve"> when an end-to-end model produces an incorrect d</w:t>
-      </w:r>
-      <w:r>
-        <w:t>escription, there is no structured intermediate output to diagnose the source of error.</w:t>
+        <w:t xml:space="preserve"> when an end-to-end model produces an incorrect description, there is no structured intermediate output to diagnose the source of error.</w:t>
       </w:r>
     </w:p>
     <w:p>
@@ -6958,7 +6821,11 @@
         <w:jc w:val="both"/>
       </w:pPr>
       <w:r>
-        <w:t>The present system's key advantage is modularity and interpretability. Every component of the pipeline can be upgraded or replaced independently. The USR provides a structured, machine-readable intermediate representation that could drive downstream applications without re-processing. The pipeline's output is grounded in specific, verifiable observations, reducing unconstrained hallucination relative to unguided VLM generation.</w:t>
+        <w:t>The present system's key advantage is modularity and interpretability. Every component of the pipeline can be upgraded or replaced independently. The USR provides a structured, machine-readable intermediate representation that could drive downstream applications without re-</w:t>
+      </w:r>
+      <w:r>
+        <w:lastRenderedPageBreak/>
+        <w:t>processing. The pipeline's output is grounded in specific, verifiable observations, reducing unconstrained hallucination relative to unguided VLM generation.</w:t>
       </w:r>
     </w:p>
     <w:p>
@@ -6976,13 +6843,7 @@
         <w:jc w:val="both"/>
       </w:pPr>
       <w:r>
-        <w:t>Several limitations of the current system are acknowledged. Processing latency of approximately 25 minutes per 33-second video severely precludes real-time or interactive use. This latency is a compound consequence of two factors: (i) the sequential load-infer-unload strategy, which contributes approximately 40% of total processing time in model load/unload overhead and was necessitated by the 16 GB VRAM ceiling of the NVIDIA T4 GPU; and (ii) the T4's lower FP32 and FP16 throughput compared to the A10 GPU o</w:t>
-      </w:r>
-      <w:r>
-        <w:t>riginally planned for deployment on EC2 g5.2xlarge. An AWS quota increase request to access g5.2xlarge (requiring 8 vCPUs for G-class instances) was rejected on April 6, 2026 (case 177464638200784), citing insufficient usage history, forcing all Phase 3 processing onto the less powerful g4dn.xlarge. The 1 FPS sampling rate misses rapid sub-second events. The heuristic scene graph generator cannot capture non-spatial semantic relationships. Fixed 640×360 processing resolution causes information loss for high</w:t>
-      </w:r>
-      <w:r>
-        <w:t>-resolution input videos. The CLAP event classification is English-centric and may underperform on non-English audio contexts.</w:t>
+        <w:t>Several limitations of the current system are acknowledged. Processing latency of approximately 25 minutes per 33-second video severely precludes real-time or interactive use. This latency is a compound consequence of two factors: (i) the sequential load-infer-unload strategy, which contributes approximately 40% of total processing time in model load/unload overhead and was necessitated by the 16 GB VRAM ceiling of the NVIDIA T4 GPU; and (ii) the T4's lower FP32 and FP16 throughput compared to the A10 GPU originally planned for deployment on EC2 g5.2xlarge. An AWS quota increase request to access g5.2xlarge (requiring 8 vCPUs for G-class instances) was rejected on April 6, 2026 (case 177464638200784), citing insufficient usage history, forcing all Phase 3 processing onto the less powerful g4dn.xlarge. The 1 FPS sampling rate misses rapid sub-second events. The heuristic scene graph generator cannot capture non-spatial semantic relationships. Fixed 640×360 processing resolution causes information loss for high-resolution input videos. The CLAP event classification is English-centric and may underperform on non-English audio contexts.</w:t>
       </w:r>
     </w:p>
     <w:p>
@@ -7002,19 +6863,7 @@
         <w:jc w:val="both"/>
       </w:pPr>
       <w:r>
-        <w:t>Several extensions are identified for future research. First, and most immediately impactful, upgrading to an EC2 g5.2xlarge instance (NVIDIA A10, 24 GB VRAM) once AWS quota approval is obtained would reduce end-to-end processing time from approximately 25 minutes to an estimated 3–4 minutes for a 33-second video, based on the A10's significantly higher tensor throughput. Resubmitting the quota increase request with documented usage history accumulated during Phase 3 testing is the recommended first step. S</w:t>
-      </w:r>
-      <w:r>
-        <w:t xml:space="preserve">econd, a GPU memory scheduler that maintains frequently used models resident in VRAM between frames while swapping infrequently used models could substantially reduce the per-frame load/unload overhead even within the current T4 constraint. Third, adaptive </w:t>
-      </w:r>
-      <w:r>
-        <w:t xml:space="preserve">frame sampling using optical flow motion estimation could increase the sampling rate during high-motion segments and reduce it during static scenes, improving the quality/cost trade-off without proportional latency increase. Fourth, a learned scene graph </w:t>
-      </w:r>
-      <w:r>
-        <w:t>model such as MOTIFS or VCTree could replace the heuristic scene graph generator, providing richer relational context including non-spatial semantic relationships. Fifth, real-time streaming pipeline support via WebRTC or HLS ingest would enable live video analysis applications. Sixth, fine-tuning Qwen2-VL on domain-specific video understanding tasks (surveillance, sports, medical imaging) could improve caption quality for specialized use cases. Seventh, extending the narrative generation to support multipl</w:t>
-      </w:r>
-      <w:r>
-        <w:t>e output languages by instructing Claude in the target language would broaden the platform's applicability without architectural changes.</w:t>
+        <w:t>Several extensions are identified for future research. First, and most immediately impactful, upgrading to an EC2 g5.2xlarge instance (NVIDIA A10, 24 GB VRAM) once AWS quota approval is obtained would reduce end-to-end processing time from approximately 25 minutes to an estimated 3–4 minutes for a 33-second video, based on the A10's significantly higher tensor throughput. Resubmitting the quota increase request with documented usage history accumulated during Phase 3 testing is the recommended first step. Second, a GPU memory scheduler that maintains frequently used models resident in VRAM between frames while swapping infrequently used models could substantially reduce the per-frame load/unload overhead even within the current T4 constraint. Third, adaptive frame sampling using optical flow motion estimation could increase the sampling rate during high-motion segments and reduce it during static scenes, improving the quality/cost trade-off without proportional latency increase. Fourth, a learned scene graph model such as MOTIFS or VCTree could replace the heuristic scene graph generator, providing richer relational context including non-spatial semantic relationships. Fifth, real-time streaming pipeline support via WebRTC or HLS ingest would enable live video analysis applications. Sixth, fine-tuning Qwen2-VL on domain-specific video understanding tasks (surveillance, sports, medical imaging) could improve caption quality for specialized use cases. Seventh, extending the narrative generation to support multiple output languages by instructing Claude in the target language would broaden the platform's applicability without architectural changes.</w:t>
       </w:r>
     </w:p>
     <w:p>
@@ -7034,10 +6883,7 @@
         <w:jc w:val="both"/>
       </w:pPr>
       <w:r>
-        <w:t xml:space="preserve">This paper has presented a Cloud-Native Multimodal Video Understanding Platform that combines nine specialized AI perception models with a novel MultiModal Fusion Engine and large language model reasoning to produce grounded, timestamped narrative descriptions of arbitrary video content. Development proceeded through three iterative phases, each motivated by and resolving specific technical challenges: infrastructure complexity, GPU memory contention, WBF threshold calibration, data temporal alignment, and </w:t>
-      </w:r>
-      <w:r>
-        <w:t>VLM hallucination without grounding.</w:t>
+        <w:t>This paper has presented a Cloud-Native Multimodal Video Understanding Platform that combines nine specialized AI perception models with a novel MultiModal Fusion Engine and large language model reasoning to produce grounded, timestamped narrative descriptions of arbitrary video content. Development proceeded through three iterative phases, each motivated by and resolving specific technical challenges: infrastructure complexity, GPU memory contention, WBF threshold calibration, data temporal alignment, and VLM hallucination without grounding.</w:t>
       </w:r>
     </w:p>
     <w:p>
@@ -7047,10 +6893,7 @@
         <w:jc w:val="both"/>
       </w:pPr>
       <w:r>
-        <w:t>The completed system processes a 33-second video in approximately 25 minutes on an NVIDIA T4 GPU (EC2 g4dn.xlarge), maintaining a peak VRAM footprint of approximately 10.3 GB through a sequential load-infer-unload strategy — well within the T4's 16 GB budget. This processing time is higher than originally targeted, primarily because an AWS quota increase request to access the more powerful g5.2xlarge instance (NVIDIA A10, 24 GB VRAM) was rejected during the project timeline, constraining all Phase 3 work to</w:t>
-      </w:r>
-      <w:r>
-        <w:t xml:space="preserve"> the g4dn.xlarge. Quantitative evaluation across a diverse video corpus demonstrates that the multimodal fusion approach achieves higher ROUGE-L, BERTScore, and human evaluation scores than direct VLM inference, confirming the value of structured perception and fusion over end-to-end VLM generation. The ablation study identifies audio integration and fusion-engine grounding as the two modality groups with the greatest marginal contribution to narrative quality.</w:t>
+        <w:t>The completed system processes a 33-second video in approximately 25 minutes on an NVIDIA T4 GPU (EC2 g4dn.xlarge), maintaining a peak VRAM footprint of approximately 10.3 GB through a sequential load-infer-unload strategy — well within the T4's 16 GB budget. This processing time is higher than originally targeted, primarily because an AWS quota increase request to access the more powerful g5.2xlarge instance (NVIDIA A10, 24 GB VRAM) was rejected during the project timeline, constraining all Phase 3 work to the g4dn.xlarge. Quantitative evaluation across a diverse video corpus demonstrates that the multimodal fusion approach achieves higher ROUGE-L, BERTScore, and human evaluation scores than direct VLM inference, confirming the value of structured perception and fusion over end-to-end VLM generation. The ablation study identifies audio integration and fusion-engine grounding as the two modality groups with the greatest marginal contribution to narrative quality.</w:t>
       </w:r>
     </w:p>
     <w:p>
@@ -7060,14 +6903,7 @@
         <w:jc w:val="both"/>
       </w:pPr>
       <w:r>
-        <w:t>The project demonstrates that combining the precision of specialized task-specific models with the generative language capabilities of a frontier LLM produces qualitatively superior video understanding outputs compared to either approach alone. The Unified Scene Representation provides a reusable intermediate representation that grounds the language model's output in verifiable observations, reducing hallucination and improving factual accuracy. The system architecture is modular, fault-tolerant, and cloud-</w:t>
-      </w:r>
-      <w:r>
-        <w:t xml:space="preserve">native, and provides a </w:t>
-      </w:r>
-      <w:r>
-        <w:lastRenderedPageBreak/>
-        <w:t>foundation for future research in multimodal video understanding.</w:t>
+        <w:t>The project demonstrates that combining the precision of specialized task-specific models with the generative language capabilities of a frontier LLM produces qualitatively superior video understanding outputs compared to either approach alone. The Unified Scene Representation provides a reusable intermediate representation that grounds the language model's output in verifiable observations, reducing hallucination and improving factual accuracy. The system architecture is modular, fault-tolerant, and cloud-native, and provides a foundation for future research in multimodal video understanding.</w:t>
       </w:r>
     </w:p>
     <w:p>
@@ -7112,7 +6948,15 @@
           <w:sz w:val="18"/>
           <w:szCs w:val="18"/>
         </w:rPr>
-        <w:t>[1] J. Cao, J. Pang, X. Weng, R. Khirodkar, and K. Kitani, "Observation-centric SORT: Rethinking SORT for robust multi-object tracking," in Proc. IEEE/CVF CVPR, 2023, pp. 9686-9696.</w:t>
+        <w:t xml:space="preserve">[1] J. Cao, J. Pang, X. Weng, R. Khirodkar, and K. Kitani, "Observation-centric SORT: Rethinking SORT for robust </w:t>
+      </w:r>
+      <w:r>
+        <w:rPr>
+          <w:sz w:val="18"/>
+          <w:szCs w:val="18"/>
+        </w:rPr>
+        <w:lastRenderedPageBreak/>
+        <w:t>multi-object tracking," in Proc. IEEE/CVF CVPR, 2023, pp. 9686-9696.</w:t>
       </w:r>
     </w:p>
     <w:p>

</xml_diff>